<commit_message>
refactor(skills): ground tech competencies to genuine core skills and reframe 3D projects as creative exploration
</commit_message>
<xml_diff>
--- a/assets/docs/CV_ATS_Abiyyu_Shiddiq_Asad.docx
+++ b/assets/docs/CV_ATS_Abiyyu_Shiddiq_Asad.docx
@@ -74,7 +74,7 @@
         <w:spacing w:before="40" w:after="80" w:line="276" w:lineRule="auto"/>
       </w:pPr>
       <w:r>
-        <w:t>Software Engineer &amp; Front-End Developer lulusan S1 Sistem Informasi (IPK 3.64) dan D3 Manajemen Informatika (IPK 3.54). Berpengalaman membangun aplikasi web modern, sistem interaktif 3D (Three.js), dan user interface tingkat tinggi berstandar Awwwards menggunakan React, TypeScript, Tailwind CSS, dan GSAP. Memiliki sertifikasi resmi Junior Web Developer dari BNSP, pemahaman arsitektur komponen &amp; data flow, serta pengalaman pengelolaan server Linux (DevOps dasar). Berpengalaman mengerjakan proyek digital UMKM, instansi pemerintahan daerah (Bappeda &amp; Diskominfo), serta inisiatif kreatif digital mandiri.</w:t>
+        <w:t>Front-End Developer &amp; UI/UX Specialist lulusan S1 Sistem Informasi (IPK 3.64) dan D3 Manajemen Informatika (IPK 3.54). Berfokus pada perancangan antarmuka web modern berbasis React.js, Tailwind CSS, dan JavaScript modern dengan standar mobile-first. Memiliki sertifikasi resmi Junior Web Developer dari BNSP, pemahaman alur sistem informasi &amp; basis data (Laravel &amp; MySQL), serta pengalaman 2 tahun mengelola server Linux VPS. Berpengalaman mengerjakan proyek digital UMKM, instansi pemerintahan daerah (Bappeda &amp; Diskominfo), serta eksplorasi teknologi kreatif interaktif.</w:t>
       </w:r>
     </w:p>
     <w:p>
@@ -110,7 +110,7 @@
         <w:rPr>
           <w:sz w:val="19"/>
         </w:rPr>
-        <w:t>React.js, Next.js, TypeScript, JavaScript (ES6+), HTML5, CSS3, Tailwind CSS v4, Bootstrap</w:t>
+        <w:t>React.js Fundamental, JavaScript (ES6+), HTML5 &amp; Semantic CSS, Tailwind CSS v4, Bootstrap, Responsive Mobile-First</w:t>
       </w:r>
     </w:p>
     <w:p>
@@ -122,13 +122,13 @@
           <w:b/>
           <w:sz w:val="19"/>
         </w:rPr>
-        <w:t xml:space="preserve">• Creative 3D &amp; Animation: </w:t>
+        <w:t xml:space="preserve">• UI/UX &amp; Web Design: </w:t>
       </w:r>
       <w:r>
         <w:rPr>
           <w:sz w:val="19"/>
         </w:rPr>
-        <w:t>Three.js, WebGL Shader/Scene, GSAP (ScrollTrigger), Lenis Smooth Scroll, Web Audio API</w:t>
+        <w:t>Figma, Genesis Design System, Wireframing, User Flow, Design Hierarchy, Micro-Interactions</w:t>
       </w:r>
     </w:p>
     <w:p>
@@ -140,13 +140,13 @@
           <w:b/>
           <w:sz w:val="19"/>
         </w:rPr>
-        <w:t xml:space="preserve">• UI/UX &amp; Design Tools: </w:t>
+        <w:t xml:space="preserve">• Back-End &amp; Basis Data Dasar: </w:t>
       </w:r>
       <w:r>
         <w:rPr>
           <w:sz w:val="19"/>
         </w:rPr>
-        <w:t>Figma, User Flow, Wireframing, High-Fidelity Prototyping, Design Systems, Adobe Photoshop</w:t>
+        <w:t>PHP, Laravel Dasar (MVC &amp; CRUD), MySQL Database, REST API &amp; AJAX, Blade Templating</w:t>
       </w:r>
     </w:p>
     <w:p>
@@ -158,13 +158,13 @@
           <w:b/>
           <w:sz w:val="19"/>
         </w:rPr>
-        <w:t xml:space="preserve">• DevOps &amp; Server Management: </w:t>
+        <w:t xml:space="preserve">• DevOps &amp; Server Administration: </w:t>
       </w:r>
       <w:r>
         <w:rPr>
           <w:sz w:val="19"/>
         </w:rPr>
-        <w:t>Git &amp; GitHub, Vite, Linux VPS Management, Pterodactyl, PaperMC Server Optimization, REST API</w:t>
+        <w:t>Linux VPS Management (Ubuntu/Debian), Terminal CLI, Git &amp; GitHub, Vite Build Tool, Web Hosting (Netlify)</w:t>
       </w:r>
     </w:p>
     <w:p>

</xml_diff>